<commit_message>
correct the DSP-suppression claim: the attribute alone, not -max_dsp 0
The submitted numbers came from the Vivado GUI project run, whose synth_design
line is plain:

    synth_design -top top -part xc7z020clg400-1

-max_dsp 0 exists only in fpga/build.tcl, which produced the earlier in-memory
run, not the reports in the submission. The (* use_dsp = "no" *) attribute on
mult8x8 achieved DSPs = 0 of 220 on its own - the synth log shows nine
multipliers inferred with no DSP mapping.

Three paragraphs in the report credited both mechanisms; they now credit the
attribute and note -max_dsp 0 as an unused guard available in the scripted flow.

Co-Authored-By: Claude Opus 5 (1M context) <noreply@anthropic.com>
</commit_message>
<xml_diff>
--- a/docs/3x3 CNN Convolution Accelerator for Edge.docx
+++ b/docs/3x3 CNN Convolution Accelerator for Edge.docx
@@ -764,17 +764,7 @@
         <w:t xml:space="preserve">use_dsp = "no"</w:t>
       </w:r>
       <w:r>
-        <w:t xml:space="preserve"> attribute plus </w:t>
-      </w:r>
-      <w:r>
-        <w:rPr>
-          <w:rFonts w:ascii="Consolas" w:hAnsi="Consolas"/>
-          <w:sz w:val="18"/>
-        </w:rPr>
-        <w:t xml:space="preserve">-max_dsp 0</w:t>
-      </w:r>
-      <w:r>
-        <w:t xml:space="preserve"> at synthesis keeps all nine multipliers in fabric at 496 LUTs, against the 450 LUT-equivalents nine DSP48E1 blocks would count. Close to neutral on the denominator alone, but it keeps the design in one fabric type with one power model, and leaves the RTL vendor-neutral apart from that single attribute.</w:t>
+        <w:t xml:space="preserve"> attribute on mult8x8 keeps all nine multipliers in fabric at 496 LUTs, against the 450 LUT-equivalents nine DSP48E1 blocks would count. Close to neutral on the denominator alone, but it keeps the design in one fabric type with one power model, and leaves the RTL vendor-neutral apart from that single attribute.</w:t>
       </w:r>
     </w:p>
     <w:p>
@@ -3793,46 +3783,27 @@
     <w:p>
       <w:pPr/>
       <w:r>
-        <w:t xml:space="preserve">Nine instances of </w:t>
+        <w:t xml:space="preserve">Nine instances of mult8x8, each carrying </w:t>
       </w:r>
       <w:r>
         <w:rPr>
           <w:rFonts w:ascii="Consolas" w:hAnsi="Consolas"/>
           <w:sz w:val="18"/>
         </w:rPr>
-        <w:t xml:space="preserve">mult8x8</w:t>
-      </w:r>
-      <w:r>
-        <w:t xml:space="preserve">, each carrying </w:t>
+        <w:t xml:space="preserve">(* use_dsp = "no" *)</w:t>
+      </w:r>
+      <w:r>
+        <w:t xml:space="preserve">. Routed cost is 52-59 LUTs each, 496 LUTs for all nine - 56% of the design - with zero DSP blocks inferred. The attribute is the only vendor-specific construct in the entire RTL; on another vendor’s tool it becomes the equivalent directive and nothing else changes. The scripted flow in fpga/build.tcl also passes </w:t>
       </w:r>
       <w:r>
         <w:rPr>
           <w:rFonts w:ascii="Consolas" w:hAnsi="Consolas"/>
           <w:sz w:val="18"/>
         </w:rPr>
-        <w:t xml:space="preserve">(* use_dsp = "no" *)</w:t>
-      </w:r>
-      <w:r>
-        <w:t xml:space="preserve">; build.tcl additionally passes </w:t>
-      </w:r>
-      <w:r>
-        <w:rPr>
-          <w:rFonts w:ascii="Consolas" w:hAnsi="Consolas"/>
-          <w:sz w:val="18"/>
-        </w:rPr>
         <w:t xml:space="preserve">-max_dsp 0</w:t>
       </w:r>
       <w:r>
-        <w:t xml:space="preserve">. Routed cost is 52-59 LUTs each, </w:t>
-      </w:r>
-      <w:r>
-        <w:rPr>
-          <w:b/>
-        </w:rPr>
-        <w:t xml:space="preserve">496 LUTs for all nine - 56% of the design</w:t>
-      </w:r>
-      <w:r>
-        <w:t xml:space="preserve"> - with zero DSP blocks inferred. The attribute is the only vendor-specific construct in the entire RTL; on another vendor's tool it becomes the equivalent directive and nothing else changes.</w:t>
+        <w:t xml:space="preserve"> as a belt-and-braces guard, but it is not required: the submitted results were produced without it.</w:t>
       </w:r>
     </w:p>
     <w:p>
@@ -18574,26 +18545,7 @@
         <w:t xml:space="preserve">use_dsp = "no"</w:t>
       </w:r>
       <w:r>
-        <w:t xml:space="preserve"> attribute plus </w:t>
-      </w:r>
-      <w:r>
-        <w:rPr>
-          <w:rFonts w:ascii="Consolas" w:hAnsi="Consolas"/>
-          <w:sz w:val="18"/>
-        </w:rPr>
-        <w:t xml:space="preserve">-max_dsp 0</w:t>
-      </w:r>
-      <w:r>
-        <w:t xml:space="preserve">; the synthesis log confirms nine multipliers inferred with no DSP mapping. BRAM: the line buffers read only their final element, so Vivado infers </w:t>
-      </w:r>
-      <w:r>
-        <w:rPr>
-          <w:b/>
-        </w:rPr>
-        <w:t xml:space="preserve">16 SRLC32E</w:t>
-      </w:r>
-      <w:r>
-        <w:t xml:space="preserve"> primitives - two 8-bit-wide chains of eight - occupying 16 LUTs. No other memory primitive appears anywhere.</w:t>
+        <w:t xml:space="preserve"> attribute alone - the synthesis log for the submitted run records nine multipliers inferred with no DSP mapping and DSPs = 0 of 220. BRAM: the line buffers read only their final element, so Vivado infers 16 SRLC32E primitives - two 8-bit-wide chains of eight - occupying 16 LUTs. No other memory primitive appears anywhere.</w:t>
       </w:r>
     </w:p>
     <w:p>

</xml_diff>

<commit_message>
drop the abstract, add a contents page, expand section 11 figure by figure
Contents page after the title block lists all 19 sections and the appendix with
a line each on what they cover. Page breaks before contents, section 1 and
section 11.

Section 11 was a bare table; it now has a subsection per capture with the
figure reference, an italic caption describing what is on screen, and a short
note on what the reader should take from it. The capture index table is kept at
the end.

Co-Authored-By: Claude Opus 5 (1M context) <noreply@anthropic.com>
</commit_message>
<xml_diff>
--- a/docs/3x3 CNN Convolution Accelerator for Edge.docx
+++ b/docs/3x3 CNN Convolution Accelerator for Edge.docx
@@ -100,19 +100,640 @@
       </w:r>
     </w:p>
     <w:p>
+      <w:r>
+        <w:br w:type="page"/>
+      </w:r>
+    </w:p>
+    <w:p>
       <w:pPr>
         <w:pStyle w:val="Heading2"/>
-        <w:rPr>
-          <w:sz w:val="40"/>
-          <w:szCs w:val="40"/>
-        </w:rPr>
-      </w:pPr>
-      <w:r>
-        <w:rPr>
-          <w:sz w:val="40"/>
-          <w:szCs w:val="40"/>
-        </w:rPr>
-        <w:t>Abstract</w:t>
+      </w:pPr>
+      <w:r>
+        <w:t xml:space="preserve">Contents</w:t>
+      </w:r>
+    </w:p>
+    <w:p>
+      <w:pPr/>
+      <w:r>
+        <w:t xml:space="preserve">This report follows the order of the deliverables listed in the competition announcement.</w:t>
+      </w:r>
+    </w:p>
+    <w:tbl>
+      <w:tblPr>
+        <w:tblStyle w:val="GridTable1Light"/>
+        <w:tblW w:w="5000" w:type="pct"/>
+        <w:tblLook w:val="04A0" w:firstRow="1" w:lastRow="0" w:firstColumn="1" w:lastColumn="0" w:noHBand="0" w:noVBand="1"/>
+      </w:tblPr>
+      <w:tblGrid>
+        <w:gridCol w:w="5400"/>
+        <w:gridCol w:w="5400"/>
+      </w:tblGrid>
+      <w:tr>
+        <w:trPr>
+          <w:tblHeader/>
+        </w:trPr>
+        <w:tc>
+          <w:tcPr>
+            <w:tcW w:w="5400" w:type="dxa"/>
+          </w:tcPr>
+          <w:p>
+            <w:pPr>
+              <w:spacing w:after="0"/>
+            </w:pPr>
+            <w:r>
+              <w:rPr>
+                <w:b/>
+              </w:rPr>
+              <w:t xml:space="preserve">Section</w:t>
+            </w:r>
+          </w:p>
+        </w:tc>
+        <w:tc>
+          <w:tcPr>
+            <w:tcW w:w="5400" w:type="dxa"/>
+          </w:tcPr>
+          <w:p>
+            <w:pPr>
+              <w:spacing w:after="0"/>
+            </w:pPr>
+            <w:r>
+              <w:rPr>
+                <w:b/>
+              </w:rPr>
+              <w:t xml:space="preserve">Covers</w:t>
+            </w:r>
+          </w:p>
+        </w:tc>
+      </w:tr>
+      <w:tr>
+        <w:tc>
+          <w:tcPr>
+            <w:tcW w:w="5400" w:type="dxa"/>
+          </w:tcPr>
+          <w:p>
+            <w:pPr>
+              <w:spacing w:after="0"/>
+            </w:pPr>
+            <w:r>
+              <w:t xml:space="preserve">1. Accelerator Architecture</w:t>
+            </w:r>
+          </w:p>
+        </w:tc>
+        <w:tc>
+          <w:tcPr>
+            <w:tcW w:w="5400" w:type="dxa"/>
+          </w:tcPr>
+          <w:p>
+            <w:pPr>
+              <w:spacing w:after="0"/>
+            </w:pPr>
+            <w:r>
+              <w:t xml:space="preserve">What the core does, the control/datapath split, interface, and the three decisions taken to serve the Figure of Merit</w:t>
+            </w:r>
+          </w:p>
+        </w:tc>
+      </w:tr>
+      <w:tr>
+        <w:tc>
+          <w:tcPr>
+            <w:tcW w:w="5400" w:type="dxa"/>
+          </w:tcPr>
+          <w:p>
+            <w:pPr>
+              <w:spacing w:after="0"/>
+            </w:pPr>
+            <w:r>
+              <w:t xml:space="preserve">2. Block Diagram</w:t>
+            </w:r>
+          </w:p>
+        </w:tc>
+        <w:tc>
+          <w:tcPr>
+            <w:tcW w:w="5400" w:type="dxa"/>
+          </w:tcPr>
+          <w:p>
+            <w:pPr>
+              <w:spacing w:after="0"/>
+            </w:pPr>
+            <w:r>
+              <w:t xml:space="preserve">Top-level structure and the signals crossing between control and datapath</w:t>
+            </w:r>
+          </w:p>
+        </w:tc>
+      </w:tr>
+      <w:tr>
+        <w:tc>
+          <w:tcPr>
+            <w:tcW w:w="5400" w:type="dxa"/>
+          </w:tcPr>
+          <w:p>
+            <w:pPr>
+              <w:spacing w:after="0"/>
+            </w:pPr>
+            <w:r>
+              <w:t xml:space="preserve">3. Datapath</w:t>
+            </w:r>
+          </w:p>
+        </w:tc>
+        <w:tc>
+          <w:tcPr>
+            <w:tcW w:w="5400" w:type="dxa"/>
+          </w:tcPr>
+          <w:p>
+            <w:pPr>
+              <w:spacing w:after="0"/>
+            </w:pPr>
+            <w:r>
+              <w:t xml:space="preserve">The arithmetic chain: nine multipliers, the adder tree, the three pipeline stages, and the measured slack in each</w:t>
+            </w:r>
+          </w:p>
+        </w:tc>
+      </w:tr>
+      <w:tr>
+        <w:tc>
+          <w:tcPr>
+            <w:tcW w:w="5400" w:type="dxa"/>
+          </w:tcPr>
+          <w:p>
+            <w:pPr>
+              <w:spacing w:after="0"/>
+            </w:pPr>
+            <w:r>
+              <w:t xml:space="preserve">4. Control FSM</w:t>
+            </w:r>
+          </w:p>
+        </w:tc>
+        <w:tc>
+          <w:tcPr>
+            <w:tcW w:w="5400" w:type="dxa"/>
+          </w:tcPr>
+          <w:p>
+            <w:pPr>
+              <w:spacing w:after="0"/>
+            </w:pPr>
+            <w:r>
+              <w:t xml:space="preserve">The five states, frame bookkeeping, the registered edge flags, and how stalls are handled</w:t>
+            </w:r>
+          </w:p>
+        </w:tc>
+      </w:tr>
+      <w:tr>
+        <w:tc>
+          <w:tcPr>
+            <w:tcW w:w="5400" w:type="dxa"/>
+          </w:tcPr>
+          <w:p>
+            <w:pPr>
+              <w:spacing w:after="0"/>
+            </w:pPr>
+            <w:r>
+              <w:t xml:space="preserve">5. Memory Organization</w:t>
+            </w:r>
+          </w:p>
+        </w:tc>
+        <w:tc>
+          <w:tcPr>
+            <w:tcW w:w="5400" w:type="dxa"/>
+          </w:tcPr>
+          <w:p>
+            <w:pPr>
+              <w:spacing w:after="0"/>
+            </w:pPr>
+            <w:r>
+              <w:t xml:space="preserve">Where every bit of state lives, and why no block RAM is used anywhere</w:t>
+            </w:r>
+          </w:p>
+        </w:tc>
+      </w:tr>
+      <w:tr>
+        <w:tc>
+          <w:tcPr>
+            <w:tcW w:w="5400" w:type="dxa"/>
+          </w:tcPr>
+          <w:p>
+            <w:pPr>
+              <w:spacing w:after="0"/>
+            </w:pPr>
+            <w:r>
+              <w:t xml:space="preserve">6. Line-Buffer and Window-Generation Method</w:t>
+            </w:r>
+          </w:p>
+        </w:tc>
+        <w:tc>
+          <w:tcPr>
+            <w:tcW w:w="5400" w:type="dxa"/>
+          </w:tcPr>
+          <w:p>
+            <w:pPr>
+              <w:spacing w:after="0"/>
+            </w:pPr>
+            <w:r>
+              <w:t xml:space="preserve">The two line buffers, the nine taps, zero padding, and where the 34-cycle fill latency comes from</w:t>
+            </w:r>
+          </w:p>
+        </w:tc>
+      </w:tr>
+      <w:tr>
+        <w:tc>
+          <w:tcPr>
+            <w:tcW w:w="5400" w:type="dxa"/>
+          </w:tcPr>
+          <w:p>
+            <w:pPr>
+              <w:spacing w:after="0"/>
+            </w:pPr>
+            <w:r>
+              <w:t xml:space="preserve">7. Fixed-Point Bit-Width Analysis</w:t>
+            </w:r>
+          </w:p>
+        </w:tc>
+        <w:tc>
+          <w:tcPr>
+            <w:tcW w:w="5400" w:type="dxa"/>
+          </w:tcPr>
+          <w:p>
+            <w:pPr>
+              <w:spacing w:after="0"/>
+            </w:pPr>
+            <w:r>
+              <w:t xml:space="preserve">Why each width is what it is, and how overflow is handled</w:t>
+            </w:r>
+          </w:p>
+        </w:tc>
+      </w:tr>
+      <w:tr>
+        <w:tc>
+          <w:tcPr>
+            <w:tcW w:w="5400" w:type="dxa"/>
+          </w:tcPr>
+          <w:p>
+            <w:pPr>
+              <w:spacing w:after="0"/>
+            </w:pPr>
+            <w:r>
+              <w:t xml:space="preserve">8. RTL Implementation Details</w:t>
+            </w:r>
+          </w:p>
+        </w:tc>
+        <w:tc>
+          <w:tcPr>
+            <w:tcW w:w="5400" w:type="dxa"/>
+          </w:tcPr>
+          <w:p>
+            <w:pPr>
+              <w:spacing w:after="0"/>
+            </w:pPr>
+            <w:r>
+              <w:t xml:space="preserve">File-by-file inventory, coding decisions, and the build scripts</w:t>
+            </w:r>
+          </w:p>
+        </w:tc>
+      </w:tr>
+      <w:tr>
+        <w:tc>
+          <w:tcPr>
+            <w:tcW w:w="5400" w:type="dxa"/>
+          </w:tcPr>
+          <w:p>
+            <w:pPr>
+              <w:spacing w:after="0"/>
+            </w:pPr>
+            <w:r>
+              <w:t xml:space="preserve">9. Testbench and Verification</w:t>
+            </w:r>
+          </w:p>
+        </w:tc>
+        <w:tc>
+          <w:tcPr>
+            <w:tcW w:w="5400" w:type="dxa"/>
+          </w:tcPr>
+          <w:p>
+            <w:pPr>
+              <w:spacing w:after="0"/>
+            </w:pPr>
+            <w:r>
+              <w:t xml:space="preserve">The four testbenches, the 22-run regression, and the comparison against the reference model</w:t>
+            </w:r>
+          </w:p>
+        </w:tc>
+      </w:tr>
+      <w:tr>
+        <w:tc>
+          <w:tcPr>
+            <w:tcW w:w="5400" w:type="dxa"/>
+          </w:tcPr>
+          <w:p>
+            <w:pPr>
+              <w:spacing w:after="0"/>
+            </w:pPr>
+            <w:r>
+              <w:t xml:space="preserve">10. Golden Reference Model</w:t>
+            </w:r>
+          </w:p>
+        </w:tc>
+        <w:tc>
+          <w:tcPr>
+            <w:tcW w:w="5400" w:type="dxa"/>
+          </w:tcPr>
+          <w:p>
+            <w:pPr>
+              <w:spacing w:after="0"/>
+            </w:pPr>
+            <w:r>
+              <w:t xml:space="preserve">What the Python model computes and how the expected outputs are generated</w:t>
+            </w:r>
+          </w:p>
+        </w:tc>
+      </w:tr>
+      <w:tr>
+        <w:tc>
+          <w:tcPr>
+            <w:tcW w:w="5400" w:type="dxa"/>
+          </w:tcPr>
+          <w:p>
+            <w:pPr>
+              <w:spacing w:after="0"/>
+            </w:pPr>
+            <w:r>
+              <w:t xml:space="preserve">11. Waveform Screenshots</w:t>
+            </w:r>
+          </w:p>
+        </w:tc>
+        <w:tc>
+          <w:tcPr>
+            <w:tcW w:w="5400" w:type="dxa"/>
+          </w:tcPr>
+          <w:p>
+            <w:pPr>
+              <w:spacing w:after="0"/>
+            </w:pPr>
+            <w:r>
+              <w:t xml:space="preserve">Simulation evidence for latency, throughput, stalls, padding and the frame sequence</w:t>
+            </w:r>
+          </w:p>
+        </w:tc>
+      </w:tr>
+      <w:tr>
+        <w:tc>
+          <w:tcPr>
+            <w:tcW w:w="5400" w:type="dxa"/>
+          </w:tcPr>
+          <w:p>
+            <w:pPr>
+              <w:spacing w:after="0"/>
+            </w:pPr>
+            <w:r>
+              <w:t xml:space="preserve">12. FPGA Synthesis and Implementation Results</w:t>
+            </w:r>
+          </w:p>
+        </w:tc>
+        <w:tc>
+          <w:tcPr>
+            <w:tcW w:w="5400" w:type="dxa"/>
+          </w:tcPr>
+          <w:p>
+            <w:pPr>
+              <w:spacing w:after="0"/>
+            </w:pPr>
+            <w:r>
+              <w:t xml:space="preserve">Utilization, how zero DSP and zero BRAM were achieved, reproducibility</w:t>
+            </w:r>
+          </w:p>
+        </w:tc>
+      </w:tr>
+      <w:tr>
+        <w:tc>
+          <w:tcPr>
+            <w:tcW w:w="5400" w:type="dxa"/>
+          </w:tcPr>
+          <w:p>
+            <w:pPr>
+              <w:spacing w:after="0"/>
+            </w:pPr>
+            <w:r>
+              <w:t xml:space="preserve">13. Timing Report</w:t>
+            </w:r>
+          </w:p>
+        </w:tc>
+        <w:tc>
+          <w:tcPr>
+            <w:tcW w:w="5400" w:type="dxa"/>
+          </w:tcPr>
+          <w:p>
+            <w:pPr>
+              <w:spacing w:after="0"/>
+            </w:pPr>
+            <w:r>
+              <w:t xml:space="preserve">Slack, maximum frequency, the critical path, and why I/O paths are excluded</w:t>
+            </w:r>
+          </w:p>
+        </w:tc>
+      </w:tr>
+      <w:tr>
+        <w:tc>
+          <w:tcPr>
+            <w:tcW w:w="5400" w:type="dxa"/>
+          </w:tcPr>
+          <w:p>
+            <w:pPr>
+              <w:spacing w:after="0"/>
+            </w:pPr>
+            <w:r>
+              <w:t xml:space="preserve">14. Power Report</w:t>
+            </w:r>
+          </w:p>
+        </w:tc>
+        <w:tc>
+          <w:tcPr>
+            <w:tcW w:w="5400" w:type="dxa"/>
+          </w:tcPr>
+          <w:p>
+            <w:pPr>
+              <w:spacing w:after="0"/>
+            </w:pPr>
+            <w:r>
+              <w:t xml:space="preserve">Static, dynamic and total power, and the switching-activity methodology behind them</w:t>
+            </w:r>
+          </w:p>
+        </w:tc>
+      </w:tr>
+      <w:tr>
+        <w:tc>
+          <w:tcPr>
+            <w:tcW w:w="5400" w:type="dxa"/>
+          </w:tcPr>
+          <w:p>
+            <w:pPr>
+              <w:spacing w:after="0"/>
+            </w:pPr>
+            <w:r>
+              <w:t xml:space="preserve">15. Discussion of Design Tradeoffs</w:t>
+            </w:r>
+          </w:p>
+        </w:tc>
+        <w:tc>
+          <w:tcPr>
+            <w:tcW w:w="5400" w:type="dxa"/>
+          </w:tcPr>
+          <w:p>
+            <w:pPr>
+              <w:spacing w:after="0"/>
+            </w:pPr>
+            <w:r>
+              <w:t xml:space="preserve">The alternatives considered, including one change that was reverted</w:t>
+            </w:r>
+          </w:p>
+        </w:tc>
+      </w:tr>
+      <w:tr>
+        <w:tc>
+          <w:tcPr>
+            <w:tcW w:w="5400" w:type="dxa"/>
+          </w:tcPr>
+          <w:p>
+            <w:pPr>
+              <w:spacing w:after="0"/>
+            </w:pPr>
+            <w:r>
+              <w:t xml:space="preserve">16. Figure of Merit</w:t>
+            </w:r>
+          </w:p>
+        </w:tc>
+        <w:tc>
+          <w:tcPr>
+            <w:tcW w:w="5400" w:type="dxa"/>
+          </w:tcPr>
+          <w:p>
+            <w:pPr>
+              <w:spacing w:after="0"/>
+            </w:pPr>
+            <w:r>
+              <w:t xml:space="preserve">The calculation, the interpretations it rests on, and the required summary table</w:t>
+            </w:r>
+          </w:p>
+        </w:tc>
+      </w:tr>
+      <w:tr>
+        <w:tc>
+          <w:tcPr>
+            <w:tcW w:w="5400" w:type="dxa"/>
+          </w:tcPr>
+          <w:p>
+            <w:pPr>
+              <w:spacing w:after="0"/>
+            </w:pPr>
+            <w:r>
+              <w:t xml:space="preserve">17. Assumptions</w:t>
+            </w:r>
+          </w:p>
+        </w:tc>
+        <w:tc>
+          <w:tcPr>
+            <w:tcW w:w="5400" w:type="dxa"/>
+          </w:tcPr>
+          <w:p>
+            <w:pPr>
+              <w:spacing w:after="0"/>
+            </w:pPr>
+            <w:r>
+              <w:t xml:space="preserve">Everything assumed where the specification was silent</w:t>
+            </w:r>
+          </w:p>
+        </w:tc>
+      </w:tr>
+      <w:tr>
+        <w:tc>
+          <w:tcPr>
+            <w:tcW w:w="5400" w:type="dxa"/>
+          </w:tcPr>
+          <w:p>
+            <w:pPr>
+              <w:spacing w:after="0"/>
+            </w:pPr>
+            <w:r>
+              <w:t xml:space="preserve">18. Bonus Features</w:t>
+            </w:r>
+          </w:p>
+        </w:tc>
+        <w:tc>
+          <w:tcPr>
+            <w:tcW w:w="5400" w:type="dxa"/>
+          </w:tcPr>
+          <w:p>
+            <w:pPr>
+              <w:spacing w:after="0"/>
+            </w:pPr>
+            <w:r>
+              <w:t xml:space="preserve">Which bonuses are claimed, with the evidence, and which is not</w:t>
+            </w:r>
+          </w:p>
+        </w:tc>
+      </w:tr>
+      <w:tr>
+        <w:tc>
+          <w:tcPr>
+            <w:tcW w:w="5400" w:type="dxa"/>
+          </w:tcPr>
+          <w:p>
+            <w:pPr>
+              <w:spacing w:after="0"/>
+            </w:pPr>
+            <w:r>
+              <w:t xml:space="preserve">19. Conclusion</w:t>
+            </w:r>
+          </w:p>
+        </w:tc>
+        <w:tc>
+          <w:tcPr>
+            <w:tcW w:w="5400" w:type="dxa"/>
+          </w:tcPr>
+          <w:p>
+            <w:pPr>
+              <w:spacing w:after="0"/>
+            </w:pPr>
+            <w:r>
+              <w:t xml:space="preserve">Results, what the design does well, and what was learned</w:t>
+            </w:r>
+          </w:p>
+        </w:tc>
+      </w:tr>
+      <w:tr>
+        <w:tc>
+          <w:tcPr>
+            <w:tcW w:w="5400" w:type="dxa"/>
+          </w:tcPr>
+          <w:p>
+            <w:pPr>
+              <w:spacing w:after="0"/>
+            </w:pPr>
+            <w:r>
+              <w:t xml:space="preserve">Appendix A</w:t>
+            </w:r>
+          </w:p>
+        </w:tc>
+        <w:tc>
+          <w:tcPr>
+            <w:tcW w:w="5400" w:type="dxa"/>
+          </w:tcPr>
+          <w:p>
+            <w:pPr>
+              <w:spacing w:after="0"/>
+            </w:pPr>
+            <w:r>
+              <w:t xml:space="preserve">The submitted files and how to reproduce the results</w:t>
+            </w:r>
+          </w:p>
+        </w:tc>
+      </w:tr>
+    </w:tbl>
+    <w:p>
+      <w:pPr>
+        <w:spacing w:after="0"/>
+      </w:pPr>
+    </w:p>
+    <w:p>
+      <w:r>
+        <w:br w:type="page"/>
       </w:r>
     </w:p>
     <w:p>
@@ -16894,6 +17515,11 @@
       </w:r>
     </w:p>
     <w:p>
+      <w:r>
+        <w:br w:type="page"/>
+      </w:r>
+    </w:p>
+    <w:p>
       <w:pPr>
         <w:pStyle w:val="Heading2"/>
       </w:pPr>
@@ -16904,17 +17530,287 @@
     <w:p>
       <w:pPr/>
       <w:r>
-        <w:t xml:space="preserve">All captures are from ModelSim on the submitted RTL, timeline in nanoseconds with one gridline per 10 ns clock, cursors snapped to clock edges. Each is reproduced by </w:t>
+        <w:t xml:space="preserve">Every capture below comes from ModelSim running the submitted RTL. The timeline is in nanoseconds and the grid is set to one line per 10 ns clock period, so cycles can be counted off the picture directly. Cursors were snapped to clock edges rather than dragged, which is why the deltas come out as whole numbers of cycles.</w:t>
+      </w:r>
+    </w:p>
+    <w:p>
+      <w:pPr/>
+      <w:r>
+        <w:t xml:space="preserve">Each figure can be regenerated with </w:t>
       </w:r>
       <w:r>
         <w:rPr>
           <w:rFonts w:ascii="Consolas" w:hAnsi="Consolas"/>
           <w:sz w:val="18"/>
         </w:rPr>
-        <w:t xml:space="preserve">do sim/waves/&lt;script&gt;</w:t>
-      </w:r>
-      <w:r>
-        <w:t xml:space="preserve"> after the corresponding run.</w:t>
+        <w:t xml:space="preserve">do sim/waves/&lt;script&gt;.do</w:t>
+      </w:r>
+      <w:r>
+        <w:t xml:space="preserve"> after running the corresponding simulation.</w:t>
+      </w:r>
+    </w:p>
+    <w:p>
+      <w:pPr>
+        <w:pStyle w:val="Heading2"/>
+      </w:pPr>
+      <w:r>
+        <w:t xml:space="preserve">11.1 Fill Latency</w:t>
+      </w:r>
+    </w:p>
+    <w:p>
+      <w:pPr/>
+      <w:r>
+        <w:rPr>
+          <w:b/>
+        </w:rPr>
+        <w:t xml:space="preserve">Figure 11.1</w:t>
+      </w:r>
+      <w:r>
+        <w:t xml:space="preserve"> - docs/figures/waveforms/Latency.PNG</w:t>
+      </w:r>
+    </w:p>
+    <w:p>
+      <w:pPr/>
+      <w:r>
+        <w:t xml:space="preserve">*The first pixel is accepted at 145 ns and the first output appears at 515 ns. The 370 ns between the cursors is 37 clock cycles: 34 to fill the window and 3 for the pipeline. The nine coefficient writes are visible to the left of the first cursor, completed while busy is still low.*</w:t>
+      </w:r>
+    </w:p>
+    <w:p>
+      <w:pPr/>
+      <w:r>
+        <w:t xml:space="preserve">This is the number quoted in Table 1 for latency. It is worth noting what it is measured from - the first *accepted* pixel, not the first clock after reset - because the coefficient load happens before streaming begins and is not part of the latency figure.</w:t>
+      </w:r>
+    </w:p>
+    <w:p>
+      <w:pPr>
+        <w:pStyle w:val="Heading2"/>
+      </w:pPr>
+      <w:r>
+        <w:t xml:space="preserve">11.2 Kernel Load</w:t>
+      </w:r>
+    </w:p>
+    <w:p>
+      <w:pPr/>
+      <w:r>
+        <w:rPr>
+          <w:b/>
+        </w:rPr>
+        <w:t xml:space="preserve">Figure 11.2</w:t>
+      </w:r>
+      <w:r>
+        <w:t xml:space="preserve"> - docs/figures/waveforms/kernel_load.PNG</w:t>
+      </w:r>
+    </w:p>
+    <w:p>
+      <w:pPr/>
+      <w:r>
+        <w:t xml:space="preserve">*Nine consecutive write_en pulses with write_addr stepping 0 through 8 and the sobel_x coefficients on data_write. busy is low throughout, which is the condition coeff_reg requires before it will accept a write.*</w:t>
+      </w:r>
+    </w:p>
+    <w:p>
+      <w:pPr/>
+      <w:r>
+        <w:t xml:space="preserve">The specification asks for programmable coefficients. This shows them arriving through the actual write port during simulation rather than being loaded by an initial block, which is the distinction that matters.</w:t>
+      </w:r>
+    </w:p>
+    <w:p>
+      <w:pPr>
+        <w:pStyle w:val="Heading2"/>
+      </w:pPr>
+      <w:r>
+        <w:t xml:space="preserve">11.3 Sustained Throughput</w:t>
+      </w:r>
+    </w:p>
+    <w:p>
+      <w:pPr/>
+      <w:r>
+        <w:rPr>
+          <w:b/>
+        </w:rPr>
+        <w:t xml:space="preserve">Figure 11.3</w:t>
+      </w:r>
+      <w:r>
+        <w:t xml:space="preserve"> - docs/figures/waveforms/throughput.PNG</w:t>
+      </w:r>
+    </w:p>
+    <w:p>
+      <w:pPr/>
+      <w:r>
+        <w:t xml:space="preserve">*The whole frame. valid_out goes high at 515 ns and stays high until 10755 ns without a single break - 10240 ns, or 1024 consecutive clock cycles, one output pixel per clock for the entire frame.*</w:t>
+      </w:r>
+    </w:p>
+    <w:p>
+      <w:pPr/>
+      <w:r>
+        <w:t xml:space="preserve">This is the evidence behind the one-pixel-per-cycle bonus claim. An unbroken bar is a stronger demonstration than a zoomed view of a few cycles would be, since a gap anywhere in the frame would show up as a notch.</w:t>
+      </w:r>
+    </w:p>
+    <w:p>
+      <w:pPr>
+        <w:pStyle w:val="Heading2"/>
+      </w:pPr>
+      <w:r>
+        <w:t xml:space="preserve">11.4 Stall Behaviour</w:t>
+      </w:r>
+    </w:p>
+    <w:p>
+      <w:pPr/>
+      <w:r>
+        <w:rPr>
+          <w:b/>
+        </w:rPr>
+        <w:t xml:space="preserve">Figure 11.4</w:t>
+      </w:r>
+      <w:r>
+        <w:t xml:space="preserve"> - docs/figures/waveforms/stall.PNG</w:t>
+      </w:r>
+    </w:p>
+    <w:p>
+      <w:pPr/>
+      <w:r>
+        <w:t xml:space="preserve">*valid_in is deasserted for three cycles just before pixel 300. en follows it down, the nine tap registers hold their values, and win_valid drops. Three cycles later the same three-cycle gap appears in valid_out.*</w:t>
+      </w:r>
+    </w:p>
+    <w:p>
+      <w:pPr/>
+      <w:r>
+        <w:t xml:space="preserve">Nothing is lost and nothing is repeated - the stall simply becomes a bubble that travels through the pipeline alongside the data. The three-cycle offset between the input gap and the output gap is the pipeline depth, and the testbench checks that relationship on every cycle of every run.</w:t>
+      </w:r>
+    </w:p>
+    <w:p>
+      <w:pPr>
+        <w:pStyle w:val="Heading2"/>
+      </w:pPr>
+      <w:r>
+        <w:t xml:space="preserve">11.5 Border Padding</w:t>
+      </w:r>
+    </w:p>
+    <w:p>
+      <w:pPr/>
+      <w:r>
+        <w:rPr>
+          <w:b/>
+        </w:rPr>
+        <w:t xml:space="preserve">Figure 11.5</w:t>
+      </w:r>
+      <w:r>
+        <w:t xml:space="preserve"> - docs/figures/waveforms/edges.PNG</w:t>
+      </w:r>
+    </w:p>
+    <w:p>
+      <w:pPr/>
+      <w:r>
+        <w:t xml:space="preserve">*A row boundary. At output column 31 right_edge is asserted and taps c, f and i read zero. One cycle later out_c wraps to 0, left_edge asserts instead, and taps a, d and g read zero. The centre tap is never masked.*</w:t>
+      </w:r>
+    </w:p>
+    <w:p>
+      <w:pPr/>
+      <w:r>
+        <w:t xml:space="preserve">This is zero-padded "same" convolution as it actually happens: the masks are combinational, driven by flags the FSM registers one position ahead, so the correct taps are already zeroed on the cycle the window is used.</w:t>
+      </w:r>
+    </w:p>
+    <w:p>
+      <w:pPr>
+        <w:pStyle w:val="Heading2"/>
+      </w:pPr>
+      <w:r>
+        <w:t xml:space="preserve">11.6 End of Frame</w:t>
+      </w:r>
+    </w:p>
+    <w:p>
+      <w:pPr/>
+      <w:r>
+        <w:rPr>
+          <w:b/>
+        </w:rPr>
+        <w:t xml:space="preserve">Figure 11.6</w:t>
+      </w:r>
+      <w:r>
+        <w:t xml:space="preserve"> - docs/figures/waveforms/drain.PNG</w:t>
+      </w:r>
+    </w:p>
+    <w:p>
+      <w:pPr/>
+      <w:r>
+        <w:t xml:space="preserve">*The last input pixel arrives at 10385 ns. The FSM moves into DRAIN and keeps producing outputs for 34 more cycles with no input at all, reaching exactly 1024 outputs before frame_done pulses.*</w:t>
+      </w:r>
+    </w:p>
+    <w:p>
+      <w:pPr/>
+      <w:r>
+        <w:t xml:space="preserve">busy falls three cycles before the final valid_out, which looks wrong at first glance but is not: by then the last window has already been latched into the pipeline and only has to travel through it. A consumer should count valid_out pulses or watch frame_done rather than treat the falling edge of busy as the end of the data.</w:t>
+      </w:r>
+    </w:p>
+    <w:p>
+      <w:pPr>
+        <w:pStyle w:val="Heading2"/>
+      </w:pPr>
+      <w:r>
+        <w:t xml:space="preserve">11.7 Frame Sequence</w:t>
+      </w:r>
+    </w:p>
+    <w:p>
+      <w:pPr/>
+      <w:r>
+        <w:rPr>
+          <w:b/>
+        </w:rPr>
+        <w:t xml:space="preserve">Figure 11.7</w:t>
+      </w:r>
+      <w:r>
+        <w:t xml:space="preserve"> - docs/figures/waveforms/fsm.PNG</w:t>
+      </w:r>
+    </w:p>
+    <w:p>
+      <w:pPr/>
+      <w:r>
+        <w:t xml:space="preserve">*One complete frame through IDLE, FILL, STREAM, DRAIN, DONE and back to IDLE, with in_cnt, out_r and drain_cnt visible as the counters that drive each transition.*</w:t>
+      </w:r>
+    </w:p>
+    <w:p>
+      <w:pPr/>
+      <w:r>
+        <w:t xml:space="preserve">The state durations are 34, 990, 34 and 1 enabled cycles. STREAM is 990 rather than 1024 because the input counter is already at 34 when the state is entered - the fill cycles consumed pixels too. Outputs come from STREAM and DRAIN together, 990 + 34, which is where the 1024 comes from.</w:t>
+      </w:r>
+    </w:p>
+    <w:p>
+      <w:pPr>
+        <w:pStyle w:val="Heading2"/>
+      </w:pPr>
+      <w:r>
+        <w:t xml:space="preserve">11.8 Window Generator Unit Test</w:t>
+      </w:r>
+    </w:p>
+    <w:p>
+      <w:pPr/>
+      <w:r>
+        <w:rPr>
+          <w:b/>
+        </w:rPr>
+        <w:t xml:space="preserve">Figures 11.8 to 11.10</w:t>
+      </w:r>
+      <w:r>
+        <w:t xml:space="preserve"> - docs/figures/waveforms/Window_generator_producing_valid_taps.PNG, _valid_taps2.PNG, _last_valid_taps.PNG</w:t>
+      </w:r>
+    </w:p>
+    <w:p>
+      <w:pPr/>
+      <w:r>
+        <w:t xml:space="preserve">*The 3x3 window sliding across the image in the direct-driven unit testbench: the first complete window, an interior window part way through the frame, and the final window.*</w:t>
+      </w:r>
+    </w:p>
+    <w:p>
+      <w:pPr/>
+      <w:r>
+        <w:t xml:space="preserve">These come from the unit testbench, where en and the four edge flags are driven by hand with no FSM present. That isolation is the point - if the taps are wrong here, the fault is in window_gen and not in the control logic.</w:t>
+      </w:r>
+    </w:p>
+    <w:p>
+      <w:pPr>
+        <w:pStyle w:val="Heading2"/>
+      </w:pPr>
+      <w:r>
+        <w:t xml:space="preserve">Capture Index</w:t>
       </w:r>
     </w:p>
     <w:tbl>
@@ -16978,6 +17874,22 @@
               <w:rPr>
                 <w:b/>
               </w:rPr>
+              <w:t xml:space="preserve">Simulation run</w:t>
+            </w:r>
+          </w:p>
+        </w:tc>
+        <w:tc>
+          <w:tcPr>
+            <w:tcW w:w="2160" w:type="dxa"/>
+          </w:tcPr>
+          <w:p>
+            <w:pPr>
+              <w:spacing w:after="0"/>
+            </w:pPr>
+            <w:r>
+              <w:rPr>
+                <w:b/>
+              </w:rPr>
               <w:t xml:space="preserve">Script</w:t>
             </w:r>
           </w:p>
@@ -16995,22 +17907,6 @@
                 <w:b/>
               </w:rPr>
               <w:t xml:space="preserve">Cursors</w:t>
-            </w:r>
-          </w:p>
-        </w:tc>
-        <w:tc>
-          <w:tcPr>
-            <w:tcW w:w="2160" w:type="dxa"/>
-          </w:tcPr>
-          <w:p>
-            <w:pPr>
-              <w:spacing w:after="0"/>
-            </w:pPr>
-            <w:r>
-              <w:rPr>
-                <w:b/>
-              </w:rPr>
-              <w:t xml:space="preserve">What it proves</w:t>
             </w:r>
           </w:p>
         </w:tc>
@@ -17051,6 +17947,19 @@
               <w:spacing w:after="0"/>
             </w:pPr>
             <w:r>
+              <w:t xml:space="preserve">sobel_x</w:t>
+            </w:r>
+          </w:p>
+        </w:tc>
+        <w:tc>
+          <w:tcPr>
+            <w:tcW w:w="2160" w:type="dxa"/>
+          </w:tcPr>
+          <w:p>
+            <w:pPr>
+              <w:spacing w:after="0"/>
+            </w:pPr>
+            <w:r>
               <w:t xml:space="preserve">latency.do</w:t>
             </w:r>
           </w:p>
@@ -17065,28 +17974,6 @@
             </w:pPr>
             <w:r>
               <w:t xml:space="preserve">145 / 515 ns</w:t>
-            </w:r>
-          </w:p>
-        </w:tc>
-        <w:tc>
-          <w:tcPr>
-            <w:tcW w:w="2160" w:type="dxa"/>
-          </w:tcPr>
-          <w:p>
-            <w:pPr>
-              <w:spacing w:after="0"/>
-            </w:pPr>
-            <w:r>
-              <w:t xml:space="preserve">370 ns = </w:t>
-            </w:r>
-            <w:r>
-              <w:rPr>
-                <w:b/>
-              </w:rPr>
-              <w:t xml:space="preserve">37 cycles</w:t>
-            </w:r>
-            <w:r>
-              <w:t xml:space="preserve">: 34 fill + 3 pipeline; coefficient writes visible before, while busy is low</w:t>
             </w:r>
           </w:p>
         </w:tc>
@@ -17127,6 +18014,19 @@
               <w:spacing w:after="0"/>
             </w:pPr>
             <w:r>
+              <w:t xml:space="preserve">sobel_x</w:t>
+            </w:r>
+          </w:p>
+        </w:tc>
+        <w:tc>
+          <w:tcPr>
+            <w:tcW w:w="2160" w:type="dxa"/>
+          </w:tcPr>
+          <w:p>
+            <w:pPr>
+              <w:spacing w:after="0"/>
+            </w:pPr>
+            <w:r>
               <w:t xml:space="preserve">coeff.do</w:t>
             </w:r>
           </w:p>
@@ -17141,19 +18041,6 @@
             </w:pPr>
             <w:r>
               <w:t xml:space="preserve">-</w:t>
-            </w:r>
-          </w:p>
-        </w:tc>
-        <w:tc>
-          <w:tcPr>
-            <w:tcW w:w="2160" w:type="dxa"/>
-          </w:tcPr>
-          <w:p>
-            <w:pPr>
-              <w:spacing w:after="0"/>
-            </w:pPr>
-            <w:r>
-              <w:t xml:space="preserve">nine write_en pulses, write_addr 0-8, coefficients on data_write, busy low - programmability through the real port</w:t>
             </w:r>
           </w:p>
         </w:tc>
@@ -17194,6 +18081,19 @@
               <w:spacing w:after="0"/>
             </w:pPr>
             <w:r>
+              <w:t xml:space="preserve">sobel_x</w:t>
+            </w:r>
+          </w:p>
+        </w:tc>
+        <w:tc>
+          <w:tcPr>
+            <w:tcW w:w="2160" w:type="dxa"/>
+          </w:tcPr>
+          <w:p>
+            <w:pPr>
+              <w:spacing w:after="0"/>
+            </w:pPr>
+            <w:r>
               <w:t xml:space="preserve">throughput.do</w:t>
             </w:r>
           </w:p>
@@ -17208,28 +18108,6 @@
             </w:pPr>
             <w:r>
               <w:t xml:space="preserve">515 / 10755 ns</w:t>
-            </w:r>
-          </w:p>
-        </w:tc>
-        <w:tc>
-          <w:tcPr>
-            <w:tcW w:w="2160" w:type="dxa"/>
-          </w:tcPr>
-          <w:p>
-            <w:pPr>
-              <w:spacing w:after="0"/>
-            </w:pPr>
-            <w:r>
-              <w:t xml:space="preserve">valid_out one unbroken interval of 10240 ns = </w:t>
-            </w:r>
-            <w:r>
-              <w:rPr>
-                <w:b/>
-              </w:rPr>
-              <w:t xml:space="preserve">1024 consecutive cycles</w:t>
-            </w:r>
-            <w:r>
-              <w:t xml:space="preserve">, one pixel per clock with no gap</w:t>
             </w:r>
           </w:p>
         </w:tc>
@@ -17270,6 +18148,19 @@
               <w:spacing w:after="0"/>
             </w:pPr>
             <w:r>
+              <w:t xml:space="preserve">sobel_x, +STALL=1</w:t>
+            </w:r>
+          </w:p>
+        </w:tc>
+        <w:tc>
+          <w:tcPr>
+            <w:tcW w:w="2160" w:type="dxa"/>
+          </w:tcPr>
+          <w:p>
+            <w:pPr>
+              <w:spacing w:after="0"/>
+            </w:pPr>
+            <w:r>
               <w:t xml:space="preserve">stall.do</w:t>
             </w:r>
           </w:p>
@@ -17284,19 +18175,6 @@
             </w:pPr>
             <w:r>
               <w:t xml:space="preserve">3165 / 3195 ns</w:t>
-            </w:r>
-          </w:p>
-        </w:tc>
-        <w:tc>
-          <w:tcPr>
-            <w:tcW w:w="2160" w:type="dxa"/>
-          </w:tcPr>
-          <w:p>
-            <w:pPr>
-              <w:spacing w:after="0"/>
-            </w:pPr>
-            <w:r>
-              <w:t xml:space="preserve">valid_in low 3 cycles; en follows, taps hold, the matching bubble reaches valid_out exactly 3 cycles later</w:t>
             </w:r>
           </w:p>
         </w:tc>
@@ -17337,6 +18215,19 @@
               <w:spacing w:after="0"/>
             </w:pPr>
             <w:r>
+              <w:t xml:space="preserve">sobel_x</w:t>
+            </w:r>
+          </w:p>
+        </w:tc>
+        <w:tc>
+          <w:tcPr>
+            <w:tcW w:w="2160" w:type="dxa"/>
+          </w:tcPr>
+          <w:p>
+            <w:pPr>
+              <w:spacing w:after="0"/>
+            </w:pPr>
+            <w:r>
               <w:t xml:space="preserve">edges.do</w:t>
             </w:r>
           </w:p>
@@ -17351,19 +18242,6 @@
             </w:pPr>
             <w:r>
               <w:t xml:space="preserve">795 / 805 ns</w:t>
-            </w:r>
-          </w:p>
-        </w:tc>
-        <w:tc>
-          <w:tcPr>
-            <w:tcW w:w="2160" w:type="dxa"/>
-          </w:tcPr>
-          <w:p>
-            <w:pPr>
-              <w:spacing w:after="0"/>
-            </w:pPr>
-            <w:r>
-              <w:t xml:space="preserve">column 31: right_edge masks taps c, f, i; next cycle column 0: left_edge masks a, d, g; centre tap never masked</w:t>
             </w:r>
           </w:p>
         </w:tc>
@@ -17404,6 +18282,19 @@
               <w:spacing w:after="0"/>
             </w:pPr>
             <w:r>
+              <w:t xml:space="preserve">sobel_x</w:t>
+            </w:r>
+          </w:p>
+        </w:tc>
+        <w:tc>
+          <w:tcPr>
+            <w:tcW w:w="2160" w:type="dxa"/>
+          </w:tcPr>
+          <w:p>
+            <w:pPr>
+              <w:spacing w:after="0"/>
+            </w:pPr>
+            <w:r>
               <w:t xml:space="preserve">drain.do</w:t>
             </w:r>
           </w:p>
@@ -17418,19 +18309,6 @@
             </w:pPr>
             <w:r>
               <w:t xml:space="preserve">10385 / 10755 ns</w:t>
-            </w:r>
-          </w:p>
-        </w:tc>
-        <w:tc>
-          <w:tcPr>
-            <w:tcW w:w="2160" w:type="dxa"/>
-          </w:tcPr>
-          <w:p>
-            <w:pPr>
-              <w:spacing w:after="0"/>
-            </w:pPr>
-            <w:r>
-              <w:t xml:space="preserve">last input in, DRAIN produces 34 more outputs, frame_done pulses, busy falls 3 cycles early</w:t>
             </w:r>
           </w:p>
         </w:tc>
@@ -17471,6 +18349,19 @@
               <w:spacing w:after="0"/>
             </w:pPr>
             <w:r>
+              <w:t xml:space="preserve">sobel_x</w:t>
+            </w:r>
+          </w:p>
+        </w:tc>
+        <w:tc>
+          <w:tcPr>
+            <w:tcW w:w="2160" w:type="dxa"/>
+          </w:tcPr>
+          <w:p>
+            <w:pPr>
+              <w:spacing w:after="0"/>
+            </w:pPr>
+            <w:r>
               <w:t xml:space="preserve">fsm.do</w:t>
             </w:r>
           </w:p>
@@ -17485,19 +18376,6 @@
             </w:pPr>
             <w:r>
               <w:t xml:space="preserve">-</w:t>
-            </w:r>
-          </w:p>
-        </w:tc>
-        <w:tc>
-          <w:tcPr>
-            <w:tcW w:w="2160" w:type="dxa"/>
-          </w:tcPr>
-          <w:p>
-            <w:pPr>
-              <w:spacing w:after="0"/>
-            </w:pPr>
-            <w:r>
-              <w:t xml:space="preserve">one frame through IDLE, FILL, STREAM, DRAIN, DONE with in_cnt, out_r, drain_cnt driving the transitions</w:t>
             </w:r>
           </w:p>
         </w:tc>
@@ -17538,7 +18416,7 @@
               <w:spacing w:after="0"/>
             </w:pPr>
             <w:r>
-              <w:t xml:space="preserve">unit test</w:t>
+              <w:t xml:space="preserve">unit testbench</w:t>
             </w:r>
           </w:p>
         </w:tc>
@@ -17564,7 +18442,7 @@
               <w:spacing w:after="0"/>
             </w:pPr>
             <w:r>
-              <w:t xml:space="preserve">the 3x3 window sliding: first valid window, an interior window, the last window of the frame</w:t>
+              <w:t xml:space="preserve">-</w:t>
             </w:r>
           </w:p>
         </w:tc>

</xml_diff>